<commit_message>
docs: plan autonomous scheduling, event triggers, self-healing, and goal management (ADR-016 & Steps 21-24)
</commit_message>
<xml_diff>
--- a/docs/08-marketing/InfraOps_AI_Conceitos_de_Marketing.docx
+++ b/docs/08-marketing/InfraOps_AI_Conceitos_de_Marketing.docx
@@ -5,7 +5,6 @@
     <w:p>
       <w:pPr>
         <w:pStyle w:val="Title"/>
-        <w:jc w:val="left"/>
       </w:pPr>
       <w:r>
         <w:t>InfraOps AI</w:t>
@@ -17,18 +16,17 @@
           <w:b/>
           <w:sz w:val="34"/>
         </w:rPr>
-        <w:t>Conceitos de Marketing, Posicionamento e Campanhas</w:t>
+        <w:t>Conceitos de Marketing, Posicionamento e Autonomia Governada</w:t>
       </w:r>
     </w:p>
     <w:p>
       <w:r>
         <w:rPr>
-          <w:sz w:val="22"/>
+          <w:i/>
         </w:rPr>
-        <w:t>Documento-base para identidade comercial, campanhas, banners, redes sociais, apresentações e materiais de venda.</w:t>
+        <w:t>Documento-base atualizado para campanhas, vendas, posicionamento e evolução do produto.</w:t>
       </w:r>
     </w:p>
-    <w:p/>
     <w:p>
       <w:pPr>
         <w:jc w:val="center"/>
@@ -36,10 +34,14 @@
       <w:r>
         <w:rPr>
           <w:b/>
-          <w:i/>
-          <w:sz w:val="32"/>
+          <w:sz w:val="30"/>
         </w:rPr>
-        <w:t>“Infraestrutura sob controle. Inteligência para agir.”</w:t>
+        <w:t>Infraestrutura sob controle. Inteligência para agir.</w:t>
+      </w:r>
+    </w:p>
+    <w:p>
+      <w:r>
+        <w:t>Atualização: Agosto de 2026</w:t>
       </w:r>
     </w:p>
     <w:p>
@@ -57,27 +59,18 @@
     </w:p>
     <w:p>
       <w:r>
-        <w:t>O InfraOps AI não deve ser apresentado comercialmente apenas como uma plataforma de monitoramento. O posicionamento deve enfatizar que a solução combina observabilidade, gestão de backups, prevenção de incidentes, automação operacional e Inteligência Artificial em uma única experiência.</w:t>
+        <w:rPr>
+          <w:b w:val="0"/>
+        </w:rPr>
+        <w:t>O InfraOps AI é uma plataforma inteligente de gestão, monitoramento e operação de infraestrutura que transforma servidores, virtualizadores e backups em informações claras, alertas acionáveis e operações seguras assistidas por IA com governança de Policy Engine.</w:t>
       </w:r>
     </w:p>
     <w:p>
       <w:r>
-        <w:t>Definição comercial recomendada:</w:t>
-      </w:r>
-    </w:p>
-    <w:p>
-      <w:r>
-        <w:t>O InfraOps AI é uma plataforma inteligente de gestão, monitoramento e operação de infraestrutura de TI que transforma servidores, virtualizadores e backups em informações claras, alertas acionáveis e operações assistidas por Inteligência Artificial.</w:t>
-      </w:r>
-    </w:p>
-    <w:p>
-      <w:r>
-        <w:t>Mensagem central:</w:t>
-      </w:r>
-    </w:p>
-    <w:p>
-      <w:r>
-        <w:t>Sua infraestrutura não precisa apenas ser monitorada. Ela precisa ser compreendida.</w:t>
+        <w:rPr>
+          <w:b w:val="0"/>
+        </w:rPr>
+        <w:t>A evolução planejada adiciona Autonomous Infrastructure Operations: schedules, triggers, self-healing governado e gestão contínua por objetivos. Essas capacidades devem ser comunicadas como roadmap até sua implementação.</w:t>
       </w:r>
     </w:p>
     <w:p>
@@ -85,22 +78,103 @@
         <w:pStyle w:val="Heading1"/>
       </w:pPr>
       <w:r>
-        <w:t>2. Assinatura principal da marca</w:t>
+        <w:t>2. Assinatura da marca</w:t>
       </w:r>
     </w:p>
     <w:p>
       <w:r>
-        <w:t>INFRAOPS AI</w:t>
+        <w:rPr>
+          <w:b/>
+        </w:rPr>
+        <w:t>InfraOps AI — Infraestrutura sob controle. Inteligência para agir.</w:t>
       </w:r>
     </w:p>
     <w:p>
       <w:r>
-        <w:t>Infraestrutura sob controle. Inteligência para agir.</w:t>
+        <w:rPr>
+          <w:b w:val="0"/>
+        </w:rPr>
+        <w:t>A autonomia não exige troca de slogan: ela amplia o significado de “agir”, mantendo controle e governança como parte inseparável da proposta.</w:t>
+      </w:r>
+    </w:p>
+    <w:p>
+      <w:pPr>
+        <w:pStyle w:val="Heading1"/>
+      </w:pPr>
+      <w:r>
+        <w:t>3. Narrativa operacional</w:t>
       </w:r>
     </w:p>
     <w:p>
       <w:r>
-        <w:t>A assinatura resume as duas dimensões fundamentais do produto:</w:t>
+        <w:rPr>
+          <w:b/>
+        </w:rPr>
+        <w:t>Produto atual:</w:t>
+      </w:r>
+    </w:p>
+    <w:p>
+      <w:r>
+        <w:rPr>
+          <w:b w:val="0"/>
+        </w:rPr>
+        <w:t>MONITORA → ENTENDE → ALERTA → GOVERNA → AGE → AUDITA</w:t>
+      </w:r>
+    </w:p>
+    <w:p>
+      <w:r>
+        <w:rPr>
+          <w:b/>
+        </w:rPr>
+        <w:t>Próxima geração:</w:t>
+      </w:r>
+    </w:p>
+    <w:p>
+      <w:r>
+        <w:rPr>
+          <w:b w:val="0"/>
+        </w:rPr>
+        <w:t>MONITORA → ENTENDE → ANTECIPA → GOVERNA → AGE → VALIDA → AUDITA → MANTÉM OBJETIVOS</w:t>
+      </w:r>
+    </w:p>
+    <w:p>
+      <w:pPr>
+        <w:pStyle w:val="Heading1"/>
+      </w:pPr>
+      <w:r>
+        <w:t>4. O novo conceito: Autonomia Governada</w:t>
+      </w:r>
+    </w:p>
+    <w:p>
+      <w:r>
+        <w:rPr>
+          <w:b w:val="0"/>
+        </w:rPr>
+        <w:t>O InfraOps AI não deve ser vendido como uma IA com liberdade para “fazer qualquer coisa”. O conceito comercial correto é autonomia governada: o sistema pode iniciar análises, rotinas e remediações previamente autorizadas, mas continua subordinado a Policy Engine, RBAC, Actions, approvals, locks, postchecks e auditoria.</w:t>
+      </w:r>
+    </w:p>
+    <w:p>
+      <w:r>
+        <w:rPr>
+          <w:b/>
+        </w:rPr>
+        <w:t>Frase-chave:</w:t>
+      </w:r>
+    </w:p>
+    <w:p>
+      <w:r>
+        <w:rPr>
+          <w:b w:val="0"/>
+        </w:rPr>
+        <w:t>Você define os limites. O InfraOps AI cuida da rotina.</w:t>
+      </w:r>
+    </w:p>
+    <w:p>
+      <w:pPr>
+        <w:pStyle w:val="Heading1"/>
+      </w:pPr>
+      <w:r>
+        <w:t>5. Níveis de autonomia</w:t>
       </w:r>
     </w:p>
     <w:p>
@@ -108,7 +182,7 @@
         <w:pStyle w:val="ListBullet"/>
       </w:pPr>
       <w:r>
-        <w:t>“Infraestrutura sob controle” comunica observabilidade, backup, disponibilidade, segurança operacional e prevenção.</w:t>
+        <w:t>0 — Observe: coleta e registra.</w:t>
       </w:r>
     </w:p>
     <w:p>
@@ -116,7 +190,39 @@
         <w:pStyle w:val="ListBullet"/>
       </w:pPr>
       <w:r>
-        <w:t>“Inteligência para agir” comunica análise por IA, interpretação, recomendação e execução assistida por políticas e permissões.</w:t>
+        <w:t>1 — Analyze: interpreta e relata.</w:t>
+      </w:r>
+    </w:p>
+    <w:p>
+      <w:pPr>
+        <w:pStyle w:val="ListBullet"/>
+      </w:pPr>
+      <w:r>
+        <w:t>2 — Recommend: recomenda sem executar.</w:t>
+      </w:r>
+    </w:p>
+    <w:p>
+      <w:pPr>
+        <w:pStyle w:val="ListBullet"/>
+      </w:pPr>
+      <w:r>
+        <w:t>3 — Approval: prepara e aguarda autorização humana.</w:t>
+      </w:r>
+    </w:p>
+    <w:p>
+      <w:pPr>
+        <w:pStyle w:val="ListBullet"/>
+      </w:pPr>
+      <w:r>
+        <w:t>4 — Autonomous: executa Actions explicitamente permitidas.</w:t>
+      </w:r>
+    </w:p>
+    <w:p>
+      <w:pPr>
+        <w:pStyle w:val="ListBullet"/>
+      </w:pPr>
+      <w:r>
+        <w:t>5 — Self-Healing: detecta, corrige, valida e documenta cenários homologados.</w:t>
       </w:r>
     </w:p>
     <w:p>
@@ -124,58 +230,87 @@
         <w:pStyle w:val="Heading1"/>
       </w:pPr>
       <w:r>
-        <w:t>3. Conceito narrativo da plataforma</w:t>
+        <w:t>6. Casos de uso para campanhas futuras</w:t>
+      </w:r>
+    </w:p>
+    <w:p>
+      <w:pPr>
+        <w:pStyle w:val="Heading2"/>
+      </w:pPr>
+      <w:r>
+        <w:t>Daily Infrastructure Brief</w:t>
       </w:r>
     </w:p>
     <w:p>
       <w:r>
-        <w:t>A narrativa comercial pode ser organizada em quatro verbos:</w:t>
+        <w:rPr>
+          <w:b w:val="0"/>
+        </w:rPr>
+        <w:t>Todos os dias, antes do expediente, o InfraOps AI analisa nodes, backups, alerts e capacidade e notifica apenas exceções relevantes.</w:t>
+      </w:r>
+    </w:p>
+    <w:p>
+      <w:pPr>
+        <w:pStyle w:val="Heading2"/>
+      </w:pPr>
+      <w:r>
+        <w:t>Disk Guardian</w:t>
       </w:r>
     </w:p>
     <w:p>
       <w:r>
-        <w:t>MONITORA → ENTENDE → ALERTA → AGE</w:t>
+        <w:rPr>
+          <w:b w:val="0"/>
+        </w:rPr>
+        <w:t>A plataforma acompanha espaço e tendência de crescimento. Ao atingir limites definidos, investiga e pode iniciar uma Action autorizada, preservando as policies de retenção.</w:t>
+      </w:r>
+    </w:p>
+    <w:p>
+      <w:pPr>
+        <w:pStyle w:val="Heading2"/>
+      </w:pPr>
+      <w:r>
+        <w:t>Backup Guardian</w:t>
       </w:r>
     </w:p>
     <w:p>
       <w:r>
-        <w:t>MONITORA</w:t>
-        <w:br/>
-        <w:t>Servidores, nodes, Proxmox, Virtualizor, VMs, containers, CPU, memória, disco, storage, serviços, disponibilidade e backups.</w:t>
+        <w:rPr>
+          <w:b w:val="0"/>
+        </w:rPr>
+        <w:t>Após a janela de backup, valida RPO, falhas e anomalias. Em cenários permitidos, inicia retry ou remediação segura.</w:t>
+      </w:r>
+    </w:p>
+    <w:p>
+      <w:pPr>
+        <w:pStyle w:val="Heading2"/>
+      </w:pPr>
+      <w:r>
+        <w:t>Service Self-Healing</w:t>
       </w:r>
     </w:p>
     <w:p>
       <w:r>
-        <w:t>ENTENDE</w:t>
-        <w:br/>
-        <w:t>A IA interpreta os dados técnicos e responde em linguagem natural.</w:t>
+        <w:rPr>
+          <w:b w:val="0"/>
+        </w:rPr>
+        <w:t>Um serviço conhecido falha, o sistema coleta evidências, aplica a policy, executa a Action permitida, valida o retorno e documenta o resultado.</w:t>
+      </w:r>
+    </w:p>
+    <w:p>
+      <w:pPr>
+        <w:pStyle w:val="Heading2"/>
+      </w:pPr>
+      <w:r>
+        <w:t>Goal-Oriented Operations</w:t>
       </w:r>
     </w:p>
     <w:p>
       <w:r>
-        <w:t>Exemplos:</w:t>
-        <w:br/>
-        <w:t>“Como está a infraestrutura do Cliente ABC?”</w:t>
-        <w:br/>
-        <w:t>“Quais servidores precisam da minha atenção?”</w:t>
-        <w:br/>
-        <w:t>“Por que o backup do ERP falhou?”</w:t>
-        <w:br/>
-        <w:t>“Quanto tempo falta para esse storage ficar cheio?”</w:t>
-      </w:r>
-    </w:p>
-    <w:p>
-      <w:r>
-        <w:t>ALERTA</w:t>
-        <w:br/>
-        <w:t>A plataforma deve transformar números em significado operacional. Em vez de apenas informar “Disco 91%”, pode explicar que o storage está em 91%, sua tendência de crescimento e o risco estimado.</w:t>
-      </w:r>
-    </w:p>
-    <w:p>
-      <w:r>
-        <w:t>AGE</w:t>
-        <w:br/>
-        <w:t>Usuários autorizados podem solicitar operações em linguagem natural, sempre submetidas a permissões, Policy Engine, aprovação, auditoria e catálogo fechado de Actions.</w:t>
+        <w:rPr>
+          <w:b w:val="0"/>
+        </w:rPr>
+        <w:t>Objetivos como manter 20% de espaço livre ou garantir backups dentro do RPO passam a ser acompanhados continuamente.</w:t>
       </w:r>
     </w:p>
     <w:p>
@@ -183,17 +318,7 @@
         <w:pStyle w:val="Heading1"/>
       </w:pPr>
       <w:r>
-        <w:t>4. Proposta de valor</w:t>
-      </w:r>
-    </w:p>
-    <w:p>
-      <w:r>
-        <w:t>O InfraOps AI reduz a distância entre detectar um problema e compreender o que fazer a respeito dele.</w:t>
-      </w:r>
-    </w:p>
-    <w:p>
-      <w:r>
-        <w:t>Valor para empresas de suporte/MSPs:</w:t>
+        <w:t>7. Headlines da próxima geração</w:t>
       </w:r>
     </w:p>
     <w:p>
@@ -201,7 +326,7 @@
         <w:pStyle w:val="ListBullet"/>
       </w:pPr>
       <w:r>
-        <w:t>visão centralizada de vários clientes;</w:t>
+        <w:t>Seu NOC não precisa dormir.</w:t>
       </w:r>
     </w:p>
     <w:p>
@@ -209,7 +334,7 @@
         <w:pStyle w:val="ListBullet"/>
       </w:pPr>
       <w:r>
-        <w:t>redução do suporte reativo;</w:t>
+        <w:t>Você define os limites. O InfraOps AI cuida da rotina.</w:t>
       </w:r>
     </w:p>
     <w:p>
@@ -217,7 +342,7 @@
         <w:pStyle w:val="ListBullet"/>
       </w:pPr>
       <w:r>
-        <w:t>identificação antecipada de falhas;</w:t>
+        <w:t>Da observabilidade ao autocuidado governado.</w:t>
       </w:r>
     </w:p>
     <w:p>
@@ -225,7 +350,7 @@
         <w:pStyle w:val="ListBullet"/>
       </w:pPr>
       <w:r>
-        <w:t>monitoramento de backups;</w:t>
+        <w:t>Automação com iniciativa. Governança sem concessões.</w:t>
       </w:r>
     </w:p>
     <w:p>
@@ -233,7 +358,7 @@
         <w:pStyle w:val="ListBullet"/>
       </w:pPr>
       <w:r>
-        <w:t>histórico de ações e incidentes;</w:t>
+        <w:t>Detecta. Analisa. Corrige. Valida. Documenta.</w:t>
       </w:r>
     </w:p>
     <w:p>
@@ -241,7 +366,63 @@
         <w:pStyle w:val="ListBullet"/>
       </w:pPr>
       <w:r>
-        <w:t>prestação de contas ao cliente;</w:t>
+        <w:t>E se sua infraestrutura pudesse cuidar das rotinas antes de você pedir?</w:t>
+      </w:r>
+    </w:p>
+    <w:p>
+      <w:pPr>
+        <w:pStyle w:val="Heading1"/>
+      </w:pPr>
+      <w:r>
+        <w:t>8. Campanha conceito — Seu NOC não precisa dormir</w:t>
+      </w:r>
+    </w:p>
+    <w:p>
+      <w:r>
+        <w:rPr>
+          <w:b w:val="0"/>
+        </w:rPr>
+        <w:t>Visual sugerido: ambiente escuro, clean, horário 03:47 em destaque e poucos indicadores: 32 nodes avaliados, 218 backups verificados, 1 storage em risco, 1 incidente investigado, 0 ação fora da policy.</w:t>
+      </w:r>
+    </w:p>
+    <w:p>
+      <w:r>
+        <w:rPr>
+          <w:b/>
+        </w:rPr>
+        <w:t>Headline: “Seu NOC não precisa dormir.”</w:t>
+      </w:r>
+    </w:p>
+    <w:p>
+      <w:r>
+        <w:rPr>
+          <w:b w:val="0"/>
+        </w:rPr>
+        <w:t>Subheadline: “InfraOps AI monitora continuamente e evolui para executar rotinas autônomas dentro das regras definidas pela sua operação.”</w:t>
+      </w:r>
+    </w:p>
+    <w:p>
+      <w:pPr>
+        <w:pStyle w:val="Heading1"/>
+      </w:pPr>
+      <w:r>
+        <w:t>9. Valor para MSPs</w:t>
+      </w:r>
+    </w:p>
+    <w:p>
+      <w:r>
+        <w:rPr>
+          <w:b w:val="0"/>
+        </w:rPr>
+        <w:t>A autonomia governada deve ser associada à capacidade de escalar número de clientes sem multiplicar proporcionalmente o trabalho repetitivo. Sweeps periódicos, triagem automática, briefing de exceções e self-healing controlado podem transformar o InfraOps AI em uma camada de NOC autônomo multi-tenant.</w:t>
+      </w:r>
+    </w:p>
+    <w:p>
+      <w:pPr>
+        <w:pStyle w:val="Heading1"/>
+      </w:pPr>
+      <w:r>
+        <w:t>10. Segurança como argumento comercial</w:t>
       </w:r>
     </w:p>
     <w:p>
@@ -249,12 +430,7 @@
         <w:pStyle w:val="ListBullet"/>
       </w:pPr>
       <w:r>
-        <w:t>IA para acelerar investigação e operação.</w:t>
-      </w:r>
-    </w:p>
-    <w:p>
-      <w:r>
-        <w:t>Valor para equipes internas de TI:</w:t>
+        <w:t>Autonomia não significa root livre.</w:t>
       </w:r>
     </w:p>
     <w:p>
@@ -262,7 +438,7 @@
         <w:pStyle w:val="ListBullet"/>
       </w:pPr>
       <w:r>
-        <w:t>visão consolidada;</w:t>
+        <w:t>Nenhuma Action é inventada pelo LLM.</w:t>
       </w:r>
     </w:p>
     <w:p>
@@ -270,7 +446,7 @@
         <w:pStyle w:val="ListBullet"/>
       </w:pPr>
       <w:r>
-        <w:t>menos tempo procurando informações;</w:t>
+        <w:t>DENY sempre prevalece.</w:t>
       </w:r>
     </w:p>
     <w:p>
@@ -278,7 +454,7 @@
         <w:pStyle w:val="ListBullet"/>
       </w:pPr>
       <w:r>
-        <w:t>prevenção de falta de espaço;</w:t>
+        <w:t>Aprovação humana continua obrigatória quando a policy exigir.</w:t>
       </w:r>
     </w:p>
     <w:p>
@@ -286,7 +462,7 @@
         <w:pStyle w:val="ListBullet"/>
       </w:pPr>
       <w:r>
-        <w:t>acompanhamento de disponibilidade;</w:t>
+        <w:t>Falha de postcheck interrompe automação.</w:t>
       </w:r>
     </w:p>
     <w:p>
@@ -294,7 +470,7 @@
         <w:pStyle w:val="ListBullet"/>
       </w:pPr>
       <w:r>
-        <w:t>gestão de backups;</w:t>
+        <w:t>Toda decisão autônoma é auditável ponta a ponta.</w:t>
       </w:r>
     </w:p>
     <w:p>
@@ -302,12 +478,15 @@
         <w:pStyle w:val="ListBullet"/>
       </w:pPr>
       <w:r>
-        <w:t>operação assistida e auditável.</w:t>
+        <w:t>Tenant scope permanece obrigatório.</w:t>
       </w:r>
     </w:p>
     <w:p>
+      <w:pPr>
+        <w:pStyle w:val="Heading1"/>
+      </w:pPr>
       <w:r>
-        <w:t>Valor para o cliente final:</w:t>
+        <w:t>11. Claims permitidos enquanto o roadmap não estiver implementado</w:t>
       </w:r>
     </w:p>
     <w:p>
@@ -315,7 +494,7 @@
         <w:pStyle w:val="ListBullet"/>
       </w:pPr>
       <w:r>
-        <w:t>transparência;</w:t>
+        <w:t>“Roadmap de autonomia governada.”</w:t>
       </w:r>
     </w:p>
     <w:p>
@@ -323,7 +502,7 @@
         <w:pStyle w:val="ListBullet"/>
       </w:pPr>
       <w:r>
-        <w:t>portal somente leitura;</w:t>
+        <w:t>“Próxima geração do InfraOps AI.”</w:t>
       </w:r>
     </w:p>
     <w:p>
@@ -331,7 +510,7 @@
         <w:pStyle w:val="ListBullet"/>
       </w:pPr>
       <w:r>
-        <w:t>visão da própria infraestrutura;</w:t>
+        <w:t>“Arquitetura preparada para schedules, triggers e self-healing.”</w:t>
       </w:r>
     </w:p>
     <w:p>
@@ -339,7 +518,15 @@
         <w:pStyle w:val="ListBullet"/>
       </w:pPr>
       <w:r>
-        <w:t>IA em linguagem simples;</w:t>
+        <w:t>“Visão de NOC autônomo governado.”</w:t>
+      </w:r>
+    </w:p>
+    <w:p>
+      <w:pPr>
+        <w:pStyle w:val="Heading1"/>
+      </w:pPr>
+      <w:r>
+        <w:t>12. Claims proibidos antes da implementação</w:t>
       </w:r>
     </w:p>
     <w:p>
@@ -347,7 +534,31 @@
         <w:pStyle w:val="ListBullet"/>
       </w:pPr>
       <w:r>
-        <w:t>acompanhamento de backups, alertas, SLA e saúde do ambiente.</w:t>
+        <w:t>“Self-healing já disponível” quando ainda não estiver em produção.</w:t>
+      </w:r>
+    </w:p>
+    <w:p>
+      <w:pPr>
+        <w:pStyle w:val="ListBullet"/>
+      </w:pPr>
+      <w:r>
+        <w:t>“IA resolve qualquer incidente sozinha.”</w:t>
+      </w:r>
+    </w:p>
+    <w:p>
+      <w:pPr>
+        <w:pStyle w:val="ListBullet"/>
+      </w:pPr>
+      <w:r>
+        <w:t>“Automação sem supervisão.”</w:t>
+      </w:r>
+    </w:p>
+    <w:p>
+      <w:pPr>
+        <w:pStyle w:val="ListBullet"/>
+      </w:pPr>
+      <w:r>
+        <w:t>“Zero risco” ou garantias absolutas.</w:t>
       </w:r>
     </w:p>
     <w:p>
@@ -355,996 +566,19 @@
         <w:pStyle w:val="Heading1"/>
       </w:pPr>
       <w:r>
-        <w:t>5. Pilares de comunicação</w:t>
+        <w:t>13. Conceito final</w:t>
       </w:r>
     </w:p>
     <w:p>
       <w:r>
-        <w:t>1. VISIBILIDADE</w:t>
-        <w:br/>
-        <w:t>“Toda a infraestrutura. Uma única visão.”</w:t>
-      </w:r>
-    </w:p>
-    <w:p>
-      <w:r>
-        <w:t>2. PREVENÇÃO</w:t>
-        <w:br/>
-        <w:t>“Descubra antes que vire problema.”</w:t>
-      </w:r>
-    </w:p>
-    <w:p>
-      <w:r>
-        <w:t>3. BACKUP</w:t>
-        <w:br/>
-        <w:t>“Não basta executar. É preciso validar.”</w:t>
-      </w:r>
-    </w:p>
-    <w:p>
-      <w:r>
-        <w:t>4. INTELIGÊNCIA</w:t>
-        <w:br/>
-        <w:t>“Pergunte à sua infraestrutura.”</w:t>
-      </w:r>
-    </w:p>
-    <w:p>
-      <w:r>
-        <w:t>5. AUTOMAÇÃO</w:t>
-        <w:br/>
-        <w:t>“Da análise à ação.”</w:t>
-      </w:r>
-    </w:p>
-    <w:p>
-      <w:r>
-        <w:t>6. TRANSPARÊNCIA</w:t>
-        <w:br/>
-        <w:t>“Você e seus clientes enxergando a mesma realidade.”</w:t>
-      </w:r>
-    </w:p>
-    <w:p>
-      <w:pPr>
-        <w:pStyle w:val="Heading1"/>
-      </w:pPr>
-      <w:r>
-        <w:t>6. Conceitos de campanhas</w:t>
-      </w:r>
-    </w:p>
-    <w:p>
-      <w:r>
-        <w:t>CAMPANHA A — PERGUNTE À SUA INFRAESTRUTURA</w:t>
-      </w:r>
-    </w:p>
-    <w:p>
-      <w:r>
-        <w:t>Headline:</w:t>
-        <w:br/>
-        <w:t>“E se sua infraestrutura pudesse responder?”</w:t>
-      </w:r>
-    </w:p>
-    <w:p>
-      <w:r>
-        <w:t>Complemento:</w:t>
-        <w:br/>
-        <w:t>“Agora ela pode.”</w:t>
-      </w:r>
-    </w:p>
-    <w:p>
-      <w:r>
-        <w:t>Conceito visual:</w:t>
-        <w:br/>
-        <w:t>Interface de chat limpa mostrando uma pergunta real e uma resposta objetiva da infraestrutura.</w:t>
-      </w:r>
-    </w:p>
-    <w:p>
-      <w:r>
-        <w:t>Exemplo:</w:t>
-        <w:br/>
-        <w:t>Usuário: “Como está minha infraestrutura?”</w:t>
-        <w:br/>
-        <w:t>InfraOps AI: “12 nodes monitorados. 11 saudáveis. 1 requer atenção. Todos os backups previstos nas últimas 24 horas foram concluídos.”</w:t>
-      </w:r>
-    </w:p>
-    <w:p>
-      <w:r>
-        <w:t>Objetivo:</w:t>
-        <w:br/>
-        <w:t>Apresentar a IA como forma natural de compreender infraestrutura, e não como um adereço tecnológico.</w:t>
-      </w:r>
-    </w:p>
-    <w:p>
-      <w:r>
-        <w:t>CAMPANHA B — BACKUPS</w:t>
-      </w:r>
-    </w:p>
-    <w:p>
-      <w:r>
-        <w:t>Headline:</w:t>
-        <w:br/>
-        <w:t>“Você sabe se todos os seus backups funcionaram hoje?”</w:t>
-      </w:r>
-    </w:p>
-    <w:p>
-      <w:r>
-        <w:t>Mensagem:</w:t>
-        <w:br/>
-        <w:t>“Backup configurado não significa backup realizado.”</w:t>
-      </w:r>
-    </w:p>
-    <w:p>
-      <w:r>
-        <w:t>Fechamento:</w:t>
-        <w:br/>
-        <w:t>“Não basta ter backup. É preciso saber que ele está lá.”</w:t>
-      </w:r>
-    </w:p>
-    <w:p>
-      <w:r>
-        <w:t>Objetivo:</w:t>
-        <w:br/>
-        <w:t>Atacar uma dor concreta e imediatamente compreensível.</w:t>
-      </w:r>
-    </w:p>
-    <w:p>
-      <w:r>
-        <w:t>CAMPANHA C — SUPORTE PROATIVO</w:t>
-      </w:r>
-    </w:p>
-    <w:p>
-      <w:r>
-        <w:t>Headline:</w:t>
-        <w:br/>
-        <w:t>“Pare de descobrir problemas quando o cliente liga.”</w:t>
-      </w:r>
-    </w:p>
-    <w:p>
-      <w:r>
-        <w:t>Complemento:</w:t>
-        <w:br/>
-        <w:t>“Saiba antes.”</w:t>
-      </w:r>
-    </w:p>
-    <w:p>
-      <w:r>
-        <w:t>Mensagem:</w:t>
-        <w:br/>
-        <w:t>O InfraOps AI identifica problemas, correlaciona eventos e alerta a equipe antes que a falha se transforme em chamado.</w:t>
-      </w:r>
-    </w:p>
-    <w:p>
-      <w:r>
-        <w:t>CAMPANHA D — MADRUGADA</w:t>
-      </w:r>
-    </w:p>
-    <w:p>
-      <w:r>
-        <w:t>Conceito:</w:t>
-        <w:br/>
-        <w:t>Horário em destaque, por exemplo 03:47.</w:t>
-      </w:r>
-    </w:p>
-    <w:p>
-      <w:r>
-        <w:t>Mensagem:</w:t>
-        <w:br/>
-        <w:t>“Enquanto você dorme, sua infraestrutura continua trabalhando. O InfraOps AI também.”</w:t>
-      </w:r>
-    </w:p>
-    <w:p>
-      <w:r>
-        <w:t>Dados visuais possíveis:</w:t>
-        <w:br/>
-        <w:t>218 backups verificados</w:t>
-        <w:br/>
-        <w:t>34 nodes online</w:t>
-        <w:br/>
-        <w:t>1 falha identificada</w:t>
-        <w:br/>
-        <w:t>1 alerta enviado</w:t>
-      </w:r>
-    </w:p>
-    <w:p>
-      <w:r>
-        <w:t>CAMPANHA E — DO DADO À DECISÃO</w:t>
-      </w:r>
-    </w:p>
-    <w:p>
-      <w:r>
-        <w:t>Headline:</w:t>
-        <w:br/>
-        <w:t>“Você não precisa de mais métricas. Precisa saber o que elas significam.”</w:t>
-      </w:r>
-    </w:p>
-    <w:p>
-      <w:r>
-        <w:t>Visual:</w:t>
-        <w:br/>
-        <w:t>Contrastar um painel cheio de números com uma interpretação clara da IA.</w:t>
-      </w:r>
-    </w:p>
-    <w:p>
-      <w:r>
-        <w:t>CAMPANHA F — IA OPERACIONAL</w:t>
-      </w:r>
-    </w:p>
-    <w:p>
-      <w:r>
-        <w:t>Headline:</w:t>
-        <w:br/>
-        <w:t>“Não apenas pergunte. Peça para fazer.”</w:t>
-      </w:r>
-    </w:p>
-    <w:p>
-      <w:r>
-        <w:t>Complemento:</w:t>
-        <w:br/>
-        <w:t>“Da análise à ação. Em uma conversa.”</w:t>
-      </w:r>
-    </w:p>
-    <w:p>
-      <w:r>
-        <w:t>Uso:</w:t>
-        <w:br/>
-        <w:t>Campanha posterior, quando Actions operacionais estiverem maduras e disponíveis comercialmente.</w:t>
-      </w:r>
-    </w:p>
-    <w:p>
-      <w:pPr>
-        <w:pStyle w:val="Heading1"/>
-      </w:pPr>
-      <w:r>
-        <w:t>7. Headlines e frases de impacto</w:t>
-      </w:r>
-    </w:p>
-    <w:p>
-      <w:pPr>
-        <w:pStyle w:val="ListBullet"/>
-      </w:pPr>
-      <w:r>
-        <w:t>E se sua infraestrutura pudesse responder?</w:t>
-      </w:r>
-    </w:p>
-    <w:p>
-      <w:pPr>
-        <w:pStyle w:val="ListBullet"/>
-      </w:pPr>
-      <w:r>
-        <w:t>Pergunte à sua infraestrutura.</w:t>
-      </w:r>
-    </w:p>
-    <w:p>
-      <w:pPr>
-        <w:pStyle w:val="ListBullet"/>
-      </w:pPr>
-      <w:r>
-        <w:t>Pare de descobrir problemas quando o cliente liga.</w:t>
-      </w:r>
-    </w:p>
-    <w:p>
-      <w:pPr>
-        <w:pStyle w:val="ListBullet"/>
-      </w:pPr>
-      <w:r>
-        <w:t>Você sabe se todos os seus backups funcionaram hoje?</w:t>
-      </w:r>
-    </w:p>
-    <w:p>
-      <w:pPr>
-        <w:pStyle w:val="ListBullet"/>
-      </w:pPr>
-      <w:r>
-        <w:t>Não basta ter backup. É preciso saber que ele está lá.</w:t>
-      </w:r>
-    </w:p>
-    <w:p>
-      <w:pPr>
-        <w:pStyle w:val="ListBullet"/>
-      </w:pPr>
-      <w:r>
-        <w:t>Toda a infraestrutura. Uma única visão.</w:t>
-      </w:r>
-    </w:p>
-    <w:p>
-      <w:pPr>
-        <w:pStyle w:val="ListBullet"/>
-      </w:pPr>
-      <w:r>
-        <w:t>Você não precisa de mais métricas. Precisa saber o que elas significam.</w:t>
-      </w:r>
-    </w:p>
-    <w:p>
-      <w:pPr>
-        <w:pStyle w:val="ListBullet"/>
-      </w:pPr>
-      <w:r>
-        <w:t>Do alerta à ação.</w:t>
-      </w:r>
-    </w:p>
-    <w:p>
-      <w:pPr>
-        <w:pStyle w:val="ListBullet"/>
-      </w:pPr>
-      <w:r>
-        <w:t>Sua infraestrutura fala. O InfraOps AI traduz.</w:t>
-      </w:r>
-    </w:p>
-    <w:p>
-      <w:pPr>
-        <w:pStyle w:val="ListBullet"/>
-      </w:pPr>
-      <w:r>
-        <w:t>Problemas de amanhã identificados hoje.</w:t>
-      </w:r>
-    </w:p>
-    <w:p>
-      <w:pPr>
-        <w:pStyle w:val="ListBullet"/>
-      </w:pPr>
-      <w:r>
-        <w:t>Infraestrutura sob controle. Inteligência para agir.</w:t>
-      </w:r>
-    </w:p>
-    <w:p>
-      <w:pPr>
-        <w:pStyle w:val="ListBullet"/>
-      </w:pPr>
-      <w:r>
-        <w:t>Da análise à ação. Em uma conversa.</w:t>
-      </w:r>
-    </w:p>
-    <w:p>
-      <w:pPr>
-        <w:pStyle w:val="ListBullet"/>
-      </w:pPr>
-      <w:r>
-        <w:t>A saúde da sua infraestrutura, sem linguagem complicada.</w:t>
-      </w:r>
-    </w:p>
-    <w:p>
-      <w:pPr>
-        <w:pStyle w:val="Heading1"/>
-      </w:pPr>
-      <w:r>
-        <w:t>8. Comunicação para MSPs e empresas de suporte</w:t>
-      </w:r>
-    </w:p>
-    <w:p>
-      <w:r>
-        <w:t>A mensagem deve enfatizar escala e antecipação.</w:t>
-      </w:r>
-    </w:p>
-    <w:p>
-      <w:r>
-        <w:t>Problema tradicional:</w:t>
-        <w:br/>
-        <w:t>cliente liga → técnico investiga → descobre o problema → corrige.</w:t>
-      </w:r>
-    </w:p>
-    <w:p>
-      <w:r>
-        <w:t>Modelo InfraOps AI:</w:t>
-        <w:br/>
-        <w:t>problema surge → plataforma identifica → IA analisa → equipe recebe alerta → equipe age → cliente é atendido de forma proativa.</w:t>
-      </w:r>
-    </w:p>
-    <w:p>
-      <w:r>
-        <w:t>Mensagens prioritárias:</w:t>
-        <w:br/>
-        <w:t>“Toda a infraestrutura dos seus clientes. Uma única visão.”</w:t>
-        <w:br/>
-        <w:t>“Pare de descobrir problemas quando o cliente liga.”</w:t>
-        <w:br/>
-        <w:t>“Saiba antes.”</w:t>
-        <w:br/>
-        <w:t>“Transforme suporte reativo em operação proativa.”</w:t>
-      </w:r>
-    </w:p>
-    <w:p>
-      <w:pPr>
-        <w:pStyle w:val="Heading1"/>
-      </w:pPr>
-      <w:r>
-        <w:t>9. Comunicação para o cliente final</w:t>
-      </w:r>
-    </w:p>
-    <w:p>
-      <w:r>
-        <w:t>O cliente final não precisa conhecer Prometheus, exporters, APIs, agents, RBAC ou detalhes de arquitetura.</w:t>
-      </w:r>
-    </w:p>
-    <w:p>
-      <w:r>
-        <w:t>A linguagem deve responder perguntas simples:</w:t>
-      </w:r>
-    </w:p>
-    <w:p>
-      <w:pPr>
-        <w:pStyle w:val="ListBullet"/>
-      </w:pPr>
-      <w:r>
-        <w:t>Meus backups estão em dia?</w:t>
-      </w:r>
-    </w:p>
-    <w:p>
-      <w:pPr>
-        <w:pStyle w:val="ListBullet"/>
-      </w:pPr>
-      <w:r>
-        <w:t>Existe algum problema nos servidores?</w:t>
-      </w:r>
-    </w:p>
-    <w:p>
-      <w:pPr>
-        <w:pStyle w:val="ListBullet"/>
-      </w:pPr>
-      <w:r>
-        <w:t>Estamos ficando sem espaço?</w:t>
-      </w:r>
-    </w:p>
-    <w:p>
-      <w:pPr>
-        <w:pStyle w:val="ListBullet"/>
-      </w:pPr>
-      <w:r>
-        <w:t>O que aconteceu esta semana?</w:t>
-      </w:r>
-    </w:p>
-    <w:p>
-      <w:pPr>
-        <w:pStyle w:val="ListBullet"/>
-      </w:pPr>
-      <w:r>
-        <w:t>Minha infraestrutura está saudável?</w:t>
-      </w:r>
-    </w:p>
-    <w:p>
-      <w:r>
-        <w:t>Posicionamento sugerido:</w:t>
-        <w:br/>
-        <w:t>“A saúde da sua infraestrutura, sem linguagem complicada.”</w:t>
-      </w:r>
-    </w:p>
-    <w:p>
-      <w:r>
-        <w:t>O portal read-only com IA deve ser apresentado como transparência e facilidade de acompanhamento, não como ferramenta técnica de administração.</w:t>
-      </w:r>
-    </w:p>
-    <w:p>
-      <w:pPr>
-        <w:pStyle w:val="Heading1"/>
-      </w:pPr>
-      <w:r>
-        <w:t>10. Direção visual</w:t>
-      </w:r>
-    </w:p>
-    <w:p>
-      <w:r>
-        <w:t>A identidade não deve parecer “mais um produto de IA”.</w:t>
-      </w:r>
-    </w:p>
-    <w:p>
-      <w:r>
-        <w:t>Evitar:</w:t>
-      </w:r>
-    </w:p>
-    <w:p>
-      <w:pPr>
-        <w:pStyle w:val="ListBullet"/>
-      </w:pPr>
-      <w:r>
-        <w:t>robôs;</w:t>
-      </w:r>
-    </w:p>
-    <w:p>
-      <w:pPr>
-        <w:pStyle w:val="ListBullet"/>
-      </w:pPr>
-      <w:r>
-        <w:t>cérebro digital;</w:t>
-      </w:r>
-    </w:p>
-    <w:p>
-      <w:pPr>
-        <w:pStyle w:val="ListBullet"/>
-      </w:pPr>
-      <w:r>
-        <w:t>cabeça humana com chip;</w:t>
-      </w:r>
-    </w:p>
-    <w:p>
-      <w:pPr>
-        <w:pStyle w:val="ListBullet"/>
-      </w:pPr>
-      <w:r>
-        <w:t>circuitos neon genéricos;</w:t>
-      </w:r>
-    </w:p>
-    <w:p>
-      <w:pPr>
-        <w:pStyle w:val="ListBullet"/>
-      </w:pPr>
-      <w:r>
-        <w:t>excesso de azul/roxo apenas para comunicar IA;</w:t>
-      </w:r>
-    </w:p>
-    <w:p>
-      <w:pPr>
-        <w:pStyle w:val="ListBullet"/>
-      </w:pPr>
-      <w:r>
-        <w:t>dashboards visualmente poluídos.</w:t>
-      </w:r>
-    </w:p>
-    <w:p>
-      <w:r>
-        <w:t>Direção desejada:</w:t>
-      </w:r>
-    </w:p>
-    <w:p>
-      <w:pPr>
-        <w:pStyle w:val="ListBullet"/>
-      </w:pPr>
-      <w:r>
-        <w:t>tecnologia profissional;</w:t>
-      </w:r>
-    </w:p>
-    <w:p>
-      <w:pPr>
-        <w:pStyle w:val="ListBullet"/>
-      </w:pPr>
-      <w:r>
-        <w:t>datacenter/NOC moderno;</w:t>
-      </w:r>
-    </w:p>
-    <w:p>
-      <w:pPr>
-        <w:pStyle w:val="ListBullet"/>
-      </w:pPr>
-      <w:r>
-        <w:t>visual sofisticado;</w:t>
-      </w:r>
-    </w:p>
-    <w:p>
-      <w:pPr>
-        <w:pStyle w:val="ListBullet"/>
-      </w:pPr>
-      <w:r>
-        <w:t>clean;</w:t>
-      </w:r>
-    </w:p>
-    <w:p>
-      <w:pPr>
-        <w:pStyle w:val="ListBullet"/>
-      </w:pPr>
-      <w:r>
-        <w:t>alta legibilidade;</w:t>
-      </w:r>
-    </w:p>
-    <w:p>
-      <w:pPr>
-        <w:pStyle w:val="ListBullet"/>
-      </w:pPr>
-      <w:r>
-        <w:t>bastante espaço negativo;</w:t>
-      </w:r>
-    </w:p>
-    <w:p>
-      <w:pPr>
-        <w:pStyle w:val="ListBullet"/>
-      </w:pPr>
-      <w:r>
-        <w:t>pequenos indicadores de status;</w:t>
-      </w:r>
-    </w:p>
-    <w:p>
-      <w:pPr>
-        <w:pStyle w:val="ListBullet"/>
-      </w:pPr>
-      <w:r>
-        <w:t>dados reais ou realistas da interface;</w:t>
-      </w:r>
-    </w:p>
-    <w:p>
-      <w:pPr>
-        <w:pStyle w:val="ListBullet"/>
-      </w:pPr>
-      <w:r>
-        <w:t>IA integrada naturalmente à experiência.</w:t>
-      </w:r>
-    </w:p>
-    <w:p>
-      <w:r>
-        <w:t>A Inteligência Artificial deve parecer uma capacidade da plataforma, não o único produto.</w:t>
-      </w:r>
-    </w:p>
-    <w:p>
-      <w:pPr>
-        <w:pStyle w:val="Heading1"/>
-      </w:pPr>
-      <w:r>
-        <w:t>11. Diferenciais comerciais a preservar</w:t>
-      </w:r>
-    </w:p>
-    <w:p>
-      <w:pPr>
-        <w:pStyle w:val="ListBullet"/>
-      </w:pPr>
-      <w:r>
-        <w:t>Monitoramento multi-tenant.</w:t>
-      </w:r>
-    </w:p>
-    <w:p>
-      <w:pPr>
-        <w:pStyle w:val="ListBullet"/>
-      </w:pPr>
-      <w:r>
-        <w:t>Proxmox, Virtualizor e Linux como foco inicial.</w:t>
-      </w:r>
-    </w:p>
-    <w:p>
-      <w:pPr>
-        <w:pStyle w:val="ListBullet"/>
-      </w:pPr>
-      <w:r>
-        <w:t>Monitoramento especializado de backups.</w:t>
-      </w:r>
-    </w:p>
-    <w:p>
-      <w:pPr>
-        <w:pStyle w:val="ListBullet"/>
-      </w:pPr>
-      <w:r>
-        <w:t>Expectativa de backup, não apenas existência de arquivo.</w:t>
-      </w:r>
-    </w:p>
-    <w:p>
-      <w:pPr>
-        <w:pStyle w:val="ListBullet"/>
-      </w:pPr>
-      <w:r>
-        <w:t>Detecção de backup ausente ou atrasado.</w:t>
-      </w:r>
-    </w:p>
-    <w:p>
-      <w:pPr>
-        <w:pStyle w:val="ListBullet"/>
-      </w:pPr>
-      <w:r>
-        <w:t>Análise de retenção.</w:t>
-      </w:r>
-    </w:p>
-    <w:p>
-      <w:pPr>
-        <w:pStyle w:val="ListBullet"/>
-      </w:pPr>
-      <w:r>
-        <w:t>Anomalias de tamanho.</w:t>
-      </w:r>
-    </w:p>
-    <w:p>
-      <w:pPr>
-        <w:pStyle w:val="ListBullet"/>
-      </w:pPr>
-      <w:r>
-        <w:t>Previsão de esgotamento de storage.</w:t>
-      </w:r>
-    </w:p>
-    <w:p>
-      <w:pPr>
-        <w:pStyle w:val="ListBullet"/>
-      </w:pPr>
-      <w:r>
-        <w:t>IA conversacional contextual.</w:t>
-      </w:r>
-    </w:p>
-    <w:p>
-      <w:pPr>
-        <w:pStyle w:val="ListBullet"/>
-      </w:pPr>
-      <w:r>
-        <w:t>Portal do cliente em modo leitura.</w:t>
-      </w:r>
-    </w:p>
-    <w:p>
-      <w:pPr>
-        <w:pStyle w:val="ListBullet"/>
-      </w:pPr>
-      <w:r>
-        <w:t>Automação operacional controlada.</w:t>
-      </w:r>
-    </w:p>
-    <w:p>
-      <w:pPr>
-        <w:pStyle w:val="ListBullet"/>
-      </w:pPr>
-      <w:r>
-        <w:t>Policy Engine.</w:t>
-      </w:r>
-    </w:p>
-    <w:p>
-      <w:pPr>
-        <w:pStyle w:val="ListBullet"/>
-      </w:pPr>
-      <w:r>
-        <w:t>Aprovações.</w:t>
-      </w:r>
-    </w:p>
-    <w:p>
-      <w:pPr>
-        <w:pStyle w:val="ListBullet"/>
-      </w:pPr>
-      <w:r>
-        <w:t>Auditoria.</w:t>
-      </w:r>
-    </w:p>
-    <w:p>
-      <w:pPr>
-        <w:pStyle w:val="ListBullet"/>
-      </w:pPr>
-      <w:r>
-        <w:t>Histórico de incidentes.</w:t>
-      </w:r>
-    </w:p>
-    <w:p>
-      <w:pPr>
-        <w:pStyle w:val="ListBullet"/>
-      </w:pPr>
-      <w:r>
-        <w:t>Possibilidade futura de relatórios/SLA e white-label.</w:t>
-      </w:r>
-    </w:p>
-    <w:p>
-      <w:pPr>
-        <w:pStyle w:val="Heading1"/>
-      </w:pPr>
-      <w:r>
-        <w:t>12. Regra para futuras campanhas</w:t>
-      </w:r>
-    </w:p>
-    <w:p>
-      <w:r>
-        <w:t>Toda peça deve responder pelo menos uma destas perguntas:</w:t>
-      </w:r>
-    </w:p>
-    <w:p>
-      <w:r>
-        <w:t>1. Qual dor concreta estamos mostrando?</w:t>
-        <w:br/>
-        <w:t>2. Como o InfraOps AI reduz essa dor?</w:t>
-        <w:br/>
-        <w:t>3. O benefício pode ser entendido sem conhecer infraestrutura profundamente?</w:t>
-        <w:br/>
-        <w:t>4. A IA está sendo apresentada como utilidade ou apenas como moda?</w:t>
-        <w:br/>
-        <w:t>5. Existe uma chamada visual clara?</w:t>
-        <w:br/>
-        <w:t>6. A campanha vende resultado ou apenas funcionalidade?</w:t>
-      </w:r>
-    </w:p>
-    <w:p>
-      <w:r>
-        <w:t>Priorizar campanhas baseadas em problemas reais:</w:t>
-        <w:br/>
-        <w:t>backup falhou, disco enchendo, node offline, cliente ligando antes do técnico perceber, excesso de métricas sem interpretação e falta de visibilidade centralizada.</w:t>
-      </w:r>
-    </w:p>
-    <w:p>
-      <w:pPr>
-        <w:pStyle w:val="Heading1"/>
-      </w:pPr>
-      <w:r>
-        <w:t>13. Conceito comercial resumido</w:t>
-      </w:r>
-    </w:p>
-    <w:p>
-      <w:r>
-        <w:t>O InfraOps AI deve ser percebido como um centro inteligente de operações de infraestrutura.</w:t>
-      </w:r>
-    </w:p>
-    <w:p>
-      <w:r>
-        <w:t>Ele observa continuamente a infraestrutura, entende o que os dados significam, destaca aquilo que realmente exige atenção e, quando autorizado, ajuda a executar ações operacionais de forma controlada e auditável.</w:t>
-      </w:r>
-    </w:p>
-    <w:p>
-      <w:r>
-        <w:t>Não é apenas monitoramento.</w:t>
-        <w:br/>
-        <w:t>Não é apenas backup.</w:t>
-        <w:br/>
-        <w:t>Não é apenas automação.</w:t>
-        <w:br/>
-        <w:t>Não é apenas IA.</w:t>
-      </w:r>
-    </w:p>
-    <w:p>
-      <w:r>
-        <w:t>É a camada que conecta observabilidade, inteligência e operação.</w:t>
-      </w:r>
-    </w:p>
-    <w:p>
-      <w:pPr>
-        <w:pStyle w:val="Heading1"/>
-      </w:pPr>
-      <w:r>
-        <w:t>14. Próximos materiais de marketing a desenvolver</w:t>
-      </w:r>
-    </w:p>
-    <w:p>
-      <w:r>
-        <w:t>Quando o projeto avançar, produzir:</w:t>
-      </w:r>
-    </w:p>
-    <w:p>
-      <w:pPr>
-        <w:pStyle w:val="ListBullet"/>
-      </w:pPr>
-      <w:r>
-        <w:t>identidade visual e brand guide;</w:t>
-      </w:r>
-    </w:p>
-    <w:p>
-      <w:pPr>
-        <w:pStyle w:val="ListBullet"/>
-      </w:pPr>
-      <w:r>
-        <w:t>logotipo e variações;</w:t>
-      </w:r>
-    </w:p>
-    <w:p>
-      <w:pPr>
-        <w:pStyle w:val="ListBullet"/>
-      </w:pPr>
-      <w:r>
-        <w:t>paleta oficial;</w:t>
-      </w:r>
-    </w:p>
-    <w:p>
-      <w:pPr>
-        <w:pStyle w:val="ListBullet"/>
-      </w:pPr>
-      <w:r>
-        <w:t>tipografia;</w:t>
-      </w:r>
-    </w:p>
-    <w:p>
-      <w:pPr>
-        <w:pStyle w:val="ListBullet"/>
-      </w:pPr>
-      <w:r>
-        <w:t>landing page;</w:t>
-      </w:r>
-    </w:p>
-    <w:p>
-      <w:pPr>
-        <w:pStyle w:val="ListBullet"/>
-      </w:pPr>
-      <w:r>
-        <w:t>apresentação comercial;</w:t>
-      </w:r>
-    </w:p>
-    <w:p>
-      <w:pPr>
-        <w:pStyle w:val="ListBullet"/>
-      </w:pPr>
-      <w:r>
-        <w:t>pitch de 30 segundos;</w:t>
-      </w:r>
-    </w:p>
-    <w:p>
-      <w:pPr>
-        <w:pStyle w:val="ListBullet"/>
-      </w:pPr>
-      <w:r>
-        <w:t>pitch de 2 minutos;</w:t>
-      </w:r>
-    </w:p>
-    <w:p>
-      <w:pPr>
-        <w:pStyle w:val="ListBullet"/>
-      </w:pPr>
-      <w:r>
-        <w:t>folder digital;</w:t>
-      </w:r>
-    </w:p>
-    <w:p>
-      <w:pPr>
-        <w:pStyle w:val="ListBullet"/>
-      </w:pPr>
-      <w:r>
-        <w:t>campanha de lançamento;</w:t>
-      </w:r>
-    </w:p>
-    <w:p>
-      <w:pPr>
-        <w:pStyle w:val="ListBullet"/>
-      </w:pPr>
-      <w:r>
-        <w:t>banners 1:1, 4:5, 9:16 e 16:9;</w:t>
-      </w:r>
-    </w:p>
-    <w:p>
-      <w:pPr>
-        <w:pStyle w:val="ListBullet"/>
-      </w:pPr>
-      <w:r>
-        <w:t>carrosséis educativos;</w:t>
-      </w:r>
-    </w:p>
-    <w:p>
-      <w:pPr>
-        <w:pStyle w:val="ListBullet"/>
-      </w:pPr>
-      <w:r>
-        <w:t>vídeos curtos;</w:t>
-      </w:r>
-    </w:p>
-    <w:p>
-      <w:pPr>
-        <w:pStyle w:val="ListBullet"/>
-      </w:pPr>
-      <w:r>
-        <w:t>demonstração da IA;</w:t>
-      </w:r>
-    </w:p>
-    <w:p>
-      <w:pPr>
-        <w:pStyle w:val="ListBullet"/>
-      </w:pPr>
-      <w:r>
-        <w:t>campanha específica de backups;</w:t>
-      </w:r>
-    </w:p>
-    <w:p>
-      <w:pPr>
-        <w:pStyle w:val="ListBullet"/>
-      </w:pPr>
-      <w:r>
-        <w:t>campanha específica para MSPs;</w:t>
-      </w:r>
-    </w:p>
-    <w:p>
-      <w:pPr>
-        <w:pStyle w:val="ListBullet"/>
-      </w:pPr>
-      <w:r>
-        <w:t>campanha do portal do cliente;</w:t>
-      </w:r>
-    </w:p>
-    <w:p>
-      <w:pPr>
-        <w:pStyle w:val="ListBullet"/>
-      </w:pPr>
-      <w:r>
-        <w:t>comparativo “monitoramento tradicional x InfraOps AI”;</w:t>
-      </w:r>
-    </w:p>
-    <w:p>
-      <w:pPr>
-        <w:pStyle w:val="ListBullet"/>
-      </w:pPr>
-      <w:r>
-        <w:t>material de onboarding comercial;</w:t>
-      </w:r>
-    </w:p>
-    <w:p>
-      <w:pPr>
-        <w:pStyle w:val="ListBullet"/>
-      </w:pPr>
-      <w:r>
-        <w:t>modelo de relatório mensal para clientes;</w:t>
-      </w:r>
-    </w:p>
-    <w:p>
-      <w:pPr>
-        <w:pStyle w:val="ListBullet"/>
-      </w:pPr>
-      <w:r>
-        <w:t>definição futura de planos e precificação.</w:t>
+        <w:rPr>
+          <w:b w:val="0"/>
+        </w:rPr>
+        <w:t>A direção comercial deve preservar o que já diferencia o InfraOps AI: backup como domínio central, multi-tenancy, IA contextual, operação ativa e governança. A nova geração adiciona iniciativa. O produto deixa de apenas responder ao operador e passa a acompanhar a infraestrutura de forma contínua, sempre dentro dos limites definidos pelo administrador.</w:t>
       </w:r>
     </w:p>
     <w:sectPr>
-      <w:headerReference w:type="default" r:id="rId9"/>
-      <w:footerReference w:type="default" r:id="rId10"/>
+      <w:footerReference w:type="default" r:id="rId9"/>
       <w:pgSz w:w="12240" w:h="15840"/>
       <w:pgMar w:top="1008" w:right="1152" w:bottom="1008" w:left="1152" w:header="720" w:footer="720" w:gutter="0"/>
       <w:cols w:space="720"/>
@@ -1365,28 +599,10 @@
       <w:rPr>
         <w:sz w:val="16"/>
       </w:rPr>
-      <w:t>InfraOps AI — Documento-base de Marketing</w:t>
+      <w:t>InfraOps AI — Marketing &amp; Autonomous Operations</w:t>
     </w:r>
   </w:p>
 </w:ftr>
-</file>
-
-<file path=word/header1.xml><?xml version="1.0" encoding="utf-8"?>
-<w:hdr xmlns:m="http://schemas.openxmlformats.org/officeDocument/2006/math" xmlns:mc="http://schemas.openxmlformats.org/markup-compatibility/2006" xmlns:mo="http://schemas.microsoft.com/office/mac/office/2008/main" xmlns:mv="urn:schemas-microsoft-com:mac:vml" xmlns:o="urn:schemas-microsoft-com:office:office" xmlns:r="http://schemas.openxmlformats.org/officeDocument/2006/relationships" xmlns:v="urn:schemas-microsoft-com:vml" xmlns:w10="urn:schemas-microsoft-com:office:word" xmlns:w14="http://schemas.microsoft.com/office/word/2010/wordml" xmlns:w="http://schemas.openxmlformats.org/wordprocessingml/2006/main" xmlns:wne="http://schemas.microsoft.com/office/word/2006/wordml" xmlns:wp14="http://schemas.microsoft.com/office/word/2010/wordprocessingDrawing" xmlns:wp="http://schemas.openxmlformats.org/drawingml/2006/wordprocessingDrawing" xmlns:wpc="http://schemas.microsoft.com/office/word/2010/wordprocessingCanvas" xmlns:wpg="http://schemas.microsoft.com/office/word/2010/wordprocessingGroup" xmlns:wpi="http://schemas.microsoft.com/office/word/2010/wordprocessingInk" xmlns:wps="http://schemas.microsoft.com/office/word/2010/wordprocessingShape" mc:Ignorable="w14 wp14">
-  <w:p>
-    <w:pPr>
-      <w:pStyle w:val="Header"/>
-      <w:jc w:val="right"/>
-    </w:pPr>
-    <w:r>
-      <w:rPr>
-        <w:b/>
-        <w:sz w:val="16"/>
-      </w:rPr>
-      <w:t>INFRAOPS AI  |  BRAND &amp; MARKETING CONCEPT</w:t>
-    </w:r>
-  </w:p>
-</w:hdr>
 </file>
 
 <file path=word/numbering.xml><?xml version="1.0" encoding="utf-8"?>
@@ -1816,7 +1032,7 @@
       <w:outlineLvl w:val="0"/>
     </w:pPr>
     <w:rPr>
-      <w:rFonts w:asciiTheme="majorHAnsi" w:eastAsiaTheme="majorEastAsia" w:hAnsiTheme="majorHAnsi" w:cstheme="majorBidi" w:ascii="Aptos Display" w:hAnsi="Aptos Display"/>
+      <w:rFonts w:asciiTheme="majorHAnsi" w:eastAsiaTheme="majorEastAsia" w:hAnsiTheme="majorHAnsi" w:cstheme="majorBidi" w:ascii="Aptos" w:hAnsi="Aptos"/>
       <w:b/>
       <w:bCs/>
       <w:color w:val="365F91" w:themeColor="accent1" w:themeShade="BF"/>
@@ -1840,7 +1056,7 @@
       <w:outlineLvl w:val="1"/>
     </w:pPr>
     <w:rPr>
-      <w:rFonts w:asciiTheme="majorHAnsi" w:eastAsiaTheme="majorEastAsia" w:hAnsiTheme="majorHAnsi" w:cstheme="majorBidi" w:ascii="Aptos Display" w:hAnsi="Aptos Display"/>
+      <w:rFonts w:asciiTheme="majorHAnsi" w:eastAsiaTheme="majorEastAsia" w:hAnsiTheme="majorHAnsi" w:cstheme="majorBidi" w:ascii="Aptos" w:hAnsi="Aptos"/>
       <w:b/>
       <w:bCs/>
       <w:color w:val="4F81BD" w:themeColor="accent1"/>
@@ -1864,7 +1080,7 @@
       <w:outlineLvl w:val="2"/>
     </w:pPr>
     <w:rPr>
-      <w:rFonts w:asciiTheme="majorHAnsi" w:eastAsiaTheme="majorEastAsia" w:hAnsiTheme="majorHAnsi" w:cstheme="majorBidi" w:ascii="Aptos Display" w:hAnsi="Aptos Display"/>
+      <w:rFonts w:asciiTheme="majorHAnsi" w:eastAsiaTheme="majorEastAsia" w:hAnsiTheme="majorHAnsi" w:cstheme="majorBidi"/>
       <w:b/>
       <w:bCs/>
       <w:color w:val="4F81BD" w:themeColor="accent1"/>
@@ -2105,8 +1321,7 @@
       <w:contextualSpacing/>
     </w:pPr>
     <w:rPr>
-      <w:rFonts w:asciiTheme="majorHAnsi" w:eastAsiaTheme="majorEastAsia" w:hAnsiTheme="majorHAnsi" w:cstheme="majorBidi" w:ascii="Aptos Display" w:hAnsi="Aptos Display"/>
-      <w:b/>
+      <w:rFonts w:asciiTheme="majorHAnsi" w:eastAsiaTheme="majorEastAsia" w:hAnsiTheme="majorHAnsi" w:cstheme="majorBidi" w:ascii="Aptos" w:hAnsi="Aptos"/>
       <w:color w:val="17365D" w:themeColor="text2" w:themeShade="BF"/>
       <w:spacing w:val="5"/>
       <w:kern w:val="28"/>

</xml_diff>